<commit_message>
fix EHP structured abstract: add Objectives, keep ≤250 words
Co-Authored-By: Tatsuki Onishi <bougtoir@gmail.com>
</commit_message>
<xml_diff>
--- a/heat_accidents_mortality/output/manuscript/heat_crash_mortality_ehp.docx
+++ b/heat_accidents_mortality/output/manuscript/heat_crash_mortality_ehp.docx
@@ -57,7 +57,21 @@
         <w:t xml:space="preserve">Background: </w:t>
       </w:r>
       <w:r>
-        <w:t>Ambient heat is an established mortality risk factor and heat waves are increasing; because driving continues in heat, fatal crashes may involve heat-related impairment or unrecorded heat illness.</w:t>
+        <w:t>Ambient heat is an established mortality risk factor; because driving continues in heat, fatal crashes may involve heat-related impairment or unrecorded heat illness.</w:t>
+      </w:r>
+    </w:p>
+    <w:p>
+      <w:pPr>
+        <w:spacing w:line="480" w:lineRule="auto" w:after="120"/>
+      </w:pPr>
+      <w:r>
+        <w:rPr>
+          <w:b/>
+        </w:rPr>
+        <w:t xml:space="preserve">Objectives: </w:t>
+      </w:r>
+      <w:r>
+        <w:t>We quantified the acute association between local heat anomalies and daily traffic-crash mortality in the US and Japan.</w:t>
       </w:r>
     </w:p>
     <w:p>

</xml_diff>